<commit_message>
Update report 10 tuan
</commit_message>
<xml_diff>
--- a/Week08/Week08_BaoCaoNhom.docx
+++ b/Week08/Week08_BaoCaoNhom.docx
@@ -225,6 +225,9 @@
       <w:pPr>
         <w:spacing w:after="320"/>
         <w:jc w:val="center"/>
+        <w:rPr>
+          <w:lang w:val="vi-VN"/>
+        </w:rPr>
       </w:pPr>
       <w:r>
         <w:rPr>
@@ -233,99 +236,50 @@
           <w:sz w:val="24"/>
           <w:szCs w:val="24"/>
         </w:rPr>
-        <w:t xml:space="preserve">Project: </w:t>
-      </w:r>
-      <w:proofErr w:type="spellStart"/>
-      <w:r>
-        <w:rPr>
-          <w:i/>
-          <w:iCs/>
-          <w:sz w:val="24"/>
-          <w:szCs w:val="24"/>
-        </w:rPr>
-        <w:t>ReadMore</w:t>
-      </w:r>
-      <w:proofErr w:type="spellEnd"/>
-      <w:r>
-        <w:rPr>
-          <w:i/>
-          <w:iCs/>
-          <w:sz w:val="24"/>
-          <w:szCs w:val="24"/>
-        </w:rPr>
-        <w:t xml:space="preserve"> Bookstore — </w:t>
-      </w:r>
-      <w:proofErr w:type="spellStart"/>
-      <w:r>
-        <w:rPr>
-          <w:i/>
-          <w:iCs/>
-          <w:sz w:val="24"/>
-          <w:szCs w:val="24"/>
-        </w:rPr>
-        <w:t>Nhà</w:t>
-      </w:r>
-      <w:proofErr w:type="spellEnd"/>
-      <w:r>
-        <w:rPr>
-          <w:i/>
-          <w:iCs/>
-          <w:sz w:val="24"/>
-          <w:szCs w:val="24"/>
-        </w:rPr>
-        <w:t xml:space="preserve"> </w:t>
-      </w:r>
-      <w:proofErr w:type="spellStart"/>
-      <w:r>
-        <w:rPr>
-          <w:i/>
-          <w:iCs/>
-          <w:sz w:val="24"/>
-          <w:szCs w:val="24"/>
-        </w:rPr>
-        <w:t>sách</w:t>
-      </w:r>
-      <w:proofErr w:type="spellEnd"/>
-      <w:r>
-        <w:rPr>
-          <w:i/>
-          <w:iCs/>
-          <w:sz w:val="24"/>
-          <w:szCs w:val="24"/>
-        </w:rPr>
-        <w:t xml:space="preserve"> </w:t>
-      </w:r>
-      <w:proofErr w:type="spellStart"/>
-      <w:r>
-        <w:rPr>
-          <w:i/>
-          <w:iCs/>
-          <w:sz w:val="24"/>
-          <w:szCs w:val="24"/>
-        </w:rPr>
-        <w:t>trực</w:t>
-      </w:r>
-      <w:proofErr w:type="spellEnd"/>
-      <w:r>
-        <w:rPr>
-          <w:i/>
-          <w:iCs/>
-          <w:sz w:val="24"/>
-          <w:szCs w:val="24"/>
-        </w:rPr>
-        <w:t xml:space="preserve"> </w:t>
-      </w:r>
-      <w:proofErr w:type="spellStart"/>
-      <w:r>
-        <w:rPr>
-          <w:i/>
-          <w:iCs/>
-          <w:sz w:val="24"/>
-          <w:szCs w:val="24"/>
-        </w:rPr>
-        <w:t>tuyến</w:t>
-      </w:r>
-      <w:proofErr w:type="spellEnd"/>
+        <w:t>Project: Online</w:t>
+      </w:r>
+      <w:r>
+        <w:rPr>
+          <w:i/>
+          <w:iCs/>
+          <w:sz w:val="24"/>
+          <w:szCs w:val="24"/>
+          <w:lang w:val="vi-VN"/>
+        </w:rPr>
+        <w:t xml:space="preserve"> Movie Ticket selling system</w:t>
+      </w:r>
+      <w:r>
+        <w:rPr>
+          <w:i/>
+          <w:iCs/>
+          <w:sz w:val="24"/>
+          <w:szCs w:val="24"/>
+        </w:rPr>
+        <w:t xml:space="preserve"> — </w:t>
+      </w:r>
+      <w:proofErr w:type="spellStart"/>
+      <w:r>
+        <w:rPr>
+          <w:i/>
+          <w:iCs/>
+          <w:sz w:val="24"/>
+          <w:szCs w:val="24"/>
+        </w:rPr>
+        <w:t>Bán</w:t>
+      </w:r>
+      <w:proofErr w:type="spellEnd"/>
+      <w:r>
+        <w:rPr>
+          <w:i/>
+          <w:iCs/>
+          <w:sz w:val="24"/>
+          <w:szCs w:val="24"/>
+          <w:lang w:val="vi-VN"/>
+        </w:rPr>
+        <w:t xml:space="preserve"> vé xem phim trực tuyến</w:t>
+      </w:r>
+      <w:bookmarkStart w:id="0" w:name="_GoBack"/>
+      <w:bookmarkEnd w:id="0"/>
     </w:p>
     <w:p>
       <w:pPr>
@@ -358,12 +312,6 @@
         <w:gridCol w:w="6026"/>
       </w:tblGrid>
       <w:tr>
-        <w:tblPrEx>
-          <w:tblCellMar>
-            <w:top w:w="0" w:type="dxa"/>
-            <w:bottom w:w="0" w:type="dxa"/>
-          </w:tblCellMar>
-        </w:tblPrEx>
         <w:tc>
           <w:tcPr>
             <w:tcW w:w="3000" w:type="dxa"/>
@@ -438,12 +386,6 @@
         </w:tc>
       </w:tr>
       <w:tr>
-        <w:tblPrEx>
-          <w:tblCellMar>
-            <w:top w:w="0" w:type="dxa"/>
-            <w:bottom w:w="0" w:type="dxa"/>
-          </w:tblCellMar>
-        </w:tblPrEx>
         <w:tc>
           <w:tcPr>
             <w:tcW w:w="3000" w:type="dxa"/>
@@ -550,12 +492,6 @@
         </w:tc>
       </w:tr>
       <w:tr>
-        <w:tblPrEx>
-          <w:tblCellMar>
-            <w:top w:w="0" w:type="dxa"/>
-            <w:bottom w:w="0" w:type="dxa"/>
-          </w:tblCellMar>
-        </w:tblPrEx>
         <w:tc>
           <w:tcPr>
             <w:tcW w:w="3000" w:type="dxa"/>
@@ -703,12 +639,6 @@
         </w:tc>
       </w:tr>
       <w:tr>
-        <w:tblPrEx>
-          <w:tblCellMar>
-            <w:top w:w="0" w:type="dxa"/>
-            <w:bottom w:w="0" w:type="dxa"/>
-          </w:tblCellMar>
-        </w:tblPrEx>
         <w:tc>
           <w:tcPr>
             <w:tcW w:w="3000" w:type="dxa"/>
@@ -777,12 +707,6 @@
         </w:tc>
       </w:tr>
       <w:tr>
-        <w:tblPrEx>
-          <w:tblCellMar>
-            <w:top w:w="0" w:type="dxa"/>
-            <w:bottom w:w="0" w:type="dxa"/>
-          </w:tblCellMar>
-        </w:tblPrEx>
         <w:tc>
           <w:tcPr>
             <w:tcW w:w="3000" w:type="dxa"/>
@@ -898,12 +822,6 @@
         </w:tc>
       </w:tr>
       <w:tr>
-        <w:tblPrEx>
-          <w:tblCellMar>
-            <w:top w:w="0" w:type="dxa"/>
-            <w:bottom w:w="0" w:type="dxa"/>
-          </w:tblCellMar>
-        </w:tblPrEx>
         <w:tc>
           <w:tcPr>
             <w:tcW w:w="3000" w:type="dxa"/>
@@ -1285,15 +1203,7 @@
           <w:iCs/>
           <w:color w:val="7F8C8D"/>
         </w:rPr>
-        <w:t xml:space="preserve">" / </w:t>
-      </w:r>
-      <w:r>
-        <w:rPr>
-          <w:i/>
-          <w:iCs/>
-          <w:color w:val="7F8C8D"/>
-        </w:rPr>
-        <w:t>"</w:t>
+        <w:t>" / "</w:t>
       </w:r>
       <w:proofErr w:type="spellStart"/>
       <w:r>
@@ -1399,12 +1309,6 @@
         <w:gridCol w:w="1474"/>
       </w:tblGrid>
       <w:tr>
-        <w:tblPrEx>
-          <w:tblCellMar>
-            <w:top w:w="0" w:type="dxa"/>
-            <w:bottom w:w="0" w:type="dxa"/>
-          </w:tblCellMar>
-        </w:tblPrEx>
         <w:tc>
           <w:tcPr>
             <w:tcW w:w="695" w:type="dxa"/>
@@ -1754,12 +1658,6 @@
         </w:tc>
       </w:tr>
       <w:tr>
-        <w:tblPrEx>
-          <w:tblCellMar>
-            <w:top w:w="0" w:type="dxa"/>
-            <w:bottom w:w="0" w:type="dxa"/>
-          </w:tblCellMar>
-        </w:tblPrEx>
         <w:tc>
           <w:tcPr>
             <w:tcW w:w="695" w:type="dxa"/>
@@ -1946,12 +1844,6 @@
         </w:tc>
       </w:tr>
       <w:tr>
-        <w:tblPrEx>
-          <w:tblCellMar>
-            <w:top w:w="0" w:type="dxa"/>
-            <w:bottom w:w="0" w:type="dxa"/>
-          </w:tblCellMar>
-        </w:tblPrEx>
         <w:tc>
           <w:tcPr>
             <w:tcW w:w="695" w:type="dxa"/>
@@ -2257,12 +2149,6 @@
         </w:tc>
       </w:tr>
       <w:tr>
-        <w:tblPrEx>
-          <w:tblCellMar>
-            <w:top w:w="0" w:type="dxa"/>
-            <w:bottom w:w="0" w:type="dxa"/>
-          </w:tblCellMar>
-        </w:tblPrEx>
         <w:tc>
           <w:tcPr>
             <w:tcW w:w="695" w:type="dxa"/>
@@ -2520,12 +2406,6 @@
         </w:tc>
       </w:tr>
       <w:tr>
-        <w:tblPrEx>
-          <w:tblCellMar>
-            <w:top w:w="0" w:type="dxa"/>
-            <w:bottom w:w="0" w:type="dxa"/>
-          </w:tblCellMar>
-        </w:tblPrEx>
         <w:tc>
           <w:tcPr>
             <w:tcW w:w="695" w:type="dxa"/>
@@ -2839,12 +2719,6 @@
         </w:tc>
       </w:tr>
       <w:tr>
-        <w:tblPrEx>
-          <w:tblCellMar>
-            <w:top w:w="0" w:type="dxa"/>
-            <w:bottom w:w="0" w:type="dxa"/>
-          </w:tblCellMar>
-        </w:tblPrEx>
         <w:tc>
           <w:tcPr>
             <w:tcW w:w="695" w:type="dxa"/>
@@ -3051,12 +2925,6 @@
         <w:gridCol w:w="4513"/>
       </w:tblGrid>
       <w:tr>
-        <w:tblPrEx>
-          <w:tblCellMar>
-            <w:top w:w="0" w:type="dxa"/>
-            <w:bottom w:w="0" w:type="dxa"/>
-          </w:tblCellMar>
-        </w:tblPrEx>
         <w:tc>
           <w:tcPr>
             <w:tcW w:w="4513" w:type="dxa"/>
@@ -3201,12 +3069,6 @@
         </w:tc>
       </w:tr>
       <w:tr>
-        <w:tblPrEx>
-          <w:tblCellMar>
-            <w:top w:w="0" w:type="dxa"/>
-            <w:bottom w:w="0" w:type="dxa"/>
-          </w:tblCellMar>
-        </w:tblPrEx>
         <w:tc>
           <w:tcPr>
             <w:tcW w:w="4513" w:type="dxa"/>
@@ -3659,12 +3521,6 @@
         <w:gridCol w:w="1400"/>
       </w:tblGrid>
       <w:tr>
-        <w:tblPrEx>
-          <w:tblCellMar>
-            <w:top w:w="0" w:type="dxa"/>
-            <w:bottom w:w="0" w:type="dxa"/>
-          </w:tblCellMar>
-        </w:tblPrEx>
         <w:tc>
           <w:tcPr>
             <w:tcW w:w="400" w:type="dxa"/>
@@ -3937,12 +3793,6 @@
         </w:tc>
       </w:tr>
       <w:tr>
-        <w:tblPrEx>
-          <w:tblCellMar>
-            <w:top w:w="0" w:type="dxa"/>
-            <w:bottom w:w="0" w:type="dxa"/>
-          </w:tblCellMar>
-        </w:tblPrEx>
         <w:tc>
           <w:tcPr>
             <w:tcW w:w="400" w:type="dxa"/>
@@ -4149,12 +3999,6 @@
         </w:tc>
       </w:tr>
       <w:tr>
-        <w:tblPrEx>
-          <w:tblCellMar>
-            <w:top w:w="0" w:type="dxa"/>
-            <w:bottom w:w="0" w:type="dxa"/>
-          </w:tblCellMar>
-        </w:tblPrEx>
         <w:tc>
           <w:tcPr>
             <w:tcW w:w="400" w:type="dxa"/>
@@ -4380,12 +4224,6 @@
         </w:tc>
       </w:tr>
       <w:tr>
-        <w:tblPrEx>
-          <w:tblCellMar>
-            <w:top w:w="0" w:type="dxa"/>
-            <w:bottom w:w="0" w:type="dxa"/>
-          </w:tblCellMar>
-        </w:tblPrEx>
         <w:tc>
           <w:tcPr>
             <w:tcW w:w="400" w:type="dxa"/>
@@ -4624,12 +4462,6 @@
         </w:tc>
       </w:tr>
       <w:tr>
-        <w:tblPrEx>
-          <w:tblCellMar>
-            <w:top w:w="0" w:type="dxa"/>
-            <w:bottom w:w="0" w:type="dxa"/>
-          </w:tblCellMar>
-        </w:tblPrEx>
         <w:tc>
           <w:tcPr>
             <w:tcW w:w="400" w:type="dxa"/>
@@ -4829,12 +4661,6 @@
         </w:tc>
       </w:tr>
       <w:tr>
-        <w:tblPrEx>
-          <w:tblCellMar>
-            <w:top w:w="0" w:type="dxa"/>
-            <w:bottom w:w="0" w:type="dxa"/>
-          </w:tblCellMar>
-        </w:tblPrEx>
         <w:tc>
           <w:tcPr>
             <w:tcW w:w="400" w:type="dxa"/>
@@ -5066,12 +4892,6 @@
         </w:tc>
       </w:tr>
       <w:tr>
-        <w:tblPrEx>
-          <w:tblCellMar>
-            <w:top w:w="0" w:type="dxa"/>
-            <w:bottom w:w="0" w:type="dxa"/>
-          </w:tblCellMar>
-        </w:tblPrEx>
         <w:tc>
           <w:tcPr>
             <w:tcW w:w="400" w:type="dxa"/>
@@ -9592,12 +9412,6 @@
         <w:gridCol w:w="4567"/>
       </w:tblGrid>
       <w:tr>
-        <w:tblPrEx>
-          <w:tblCellMar>
-            <w:top w:w="0" w:type="dxa"/>
-            <w:bottom w:w="0" w:type="dxa"/>
-          </w:tblCellMar>
-        </w:tblPrEx>
         <w:tc>
           <w:tcPr>
             <w:tcW w:w="4500" w:type="dxa"/>
@@ -9630,6 +9444,7 @@
               <w:rPr>
                 <w:i/>
                 <w:iCs/>
+                <w:noProof/>
                 <w:color w:val="AAB7C4"/>
                 <w:sz w:val="22"/>
                 <w:szCs w:val="22"/>
@@ -9743,6 +9558,7 @@
               <w:rPr>
                 <w:i/>
                 <w:iCs/>
+                <w:noProof/>
                 <w:color w:val="AAB7C4"/>
                 <w:sz w:val="22"/>
                 <w:szCs w:val="22"/>
@@ -9797,16 +9613,7 @@
                 <w:sz w:val="22"/>
                 <w:szCs w:val="22"/>
               </w:rPr>
-              <w:t>H</w:t>
-            </w:r>
-            <w:r>
-              <w:rPr>
-                <w:i/>
-                <w:iCs/>
-                <w:sz w:val="22"/>
-                <w:szCs w:val="22"/>
-              </w:rPr>
-              <w:t>ình</w:t>
+              <w:t>Hình</w:t>
             </w:r>
             <w:proofErr w:type="spellEnd"/>
             <w:r>
@@ -10244,12 +10051,6 @@
         <w:gridCol w:w="760"/>
       </w:tblGrid>
       <w:tr>
-        <w:tblPrEx>
-          <w:tblCellMar>
-            <w:top w:w="0" w:type="dxa"/>
-            <w:bottom w:w="0" w:type="dxa"/>
-          </w:tblCellMar>
-        </w:tblPrEx>
         <w:tc>
           <w:tcPr>
             <w:tcW w:w="364" w:type="dxa"/>
@@ -10641,12 +10442,6 @@
         </w:tc>
       </w:tr>
       <w:tr>
-        <w:tblPrEx>
-          <w:tblCellMar>
-            <w:top w:w="0" w:type="dxa"/>
-            <w:bottom w:w="0" w:type="dxa"/>
-          </w:tblCellMar>
-        </w:tblPrEx>
         <w:tc>
           <w:tcPr>
             <w:tcW w:w="364" w:type="dxa"/>
@@ -10920,12 +10715,6 @@
         </w:tc>
       </w:tr>
       <w:tr>
-        <w:tblPrEx>
-          <w:tblCellMar>
-            <w:top w:w="0" w:type="dxa"/>
-            <w:bottom w:w="0" w:type="dxa"/>
-          </w:tblCellMar>
-        </w:tblPrEx>
         <w:tc>
           <w:tcPr>
             <w:tcW w:w="364" w:type="dxa"/>
@@ -11219,12 +11008,6 @@
         </w:tc>
       </w:tr>
       <w:tr>
-        <w:tblPrEx>
-          <w:tblCellMar>
-            <w:top w:w="0" w:type="dxa"/>
-            <w:bottom w:w="0" w:type="dxa"/>
-          </w:tblCellMar>
-        </w:tblPrEx>
         <w:tc>
           <w:tcPr>
             <w:tcW w:w="364" w:type="dxa"/>
@@ -11438,12 +11221,6 @@
         </w:tc>
       </w:tr>
       <w:tr>
-        <w:tblPrEx>
-          <w:tblCellMar>
-            <w:top w:w="0" w:type="dxa"/>
-            <w:bottom w:w="0" w:type="dxa"/>
-          </w:tblCellMar>
-        </w:tblPrEx>
         <w:tc>
           <w:tcPr>
             <w:tcW w:w="364" w:type="dxa"/>
@@ -11842,12 +11619,6 @@
         </w:tc>
       </w:tr>
       <w:tr>
-        <w:tblPrEx>
-          <w:tblCellMar>
-            <w:top w:w="0" w:type="dxa"/>
-            <w:bottom w:w="0" w:type="dxa"/>
-          </w:tblCellMar>
-        </w:tblPrEx>
         <w:tc>
           <w:tcPr>
             <w:tcW w:w="364" w:type="dxa"/>
@@ -12054,12 +11825,6 @@
         </w:tc>
       </w:tr>
       <w:tr>
-        <w:tblPrEx>
-          <w:tblCellMar>
-            <w:top w:w="0" w:type="dxa"/>
-            <w:bottom w:w="0" w:type="dxa"/>
-          </w:tblCellMar>
-        </w:tblPrEx>
         <w:tc>
           <w:tcPr>
             <w:tcW w:w="364" w:type="dxa"/>
@@ -12550,12 +12315,6 @@
         <w:gridCol w:w="1839"/>
       </w:tblGrid>
       <w:tr>
-        <w:tblPrEx>
-          <w:tblCellMar>
-            <w:top w:w="0" w:type="dxa"/>
-            <w:bottom w:w="0" w:type="dxa"/>
-          </w:tblCellMar>
-        </w:tblPrEx>
         <w:tc>
           <w:tcPr>
             <w:tcW w:w="400" w:type="dxa"/>
@@ -12927,12 +12686,6 @@
         </w:tc>
       </w:tr>
       <w:tr>
-        <w:tblPrEx>
-          <w:tblCellMar>
-            <w:top w:w="0" w:type="dxa"/>
-            <w:bottom w:w="0" w:type="dxa"/>
-          </w:tblCellMar>
-        </w:tblPrEx>
         <w:tc>
           <w:tcPr>
             <w:tcW w:w="400" w:type="dxa"/>
@@ -13408,12 +13161,6 @@
         </w:tc>
       </w:tr>
       <w:tr>
-        <w:tblPrEx>
-          <w:tblCellMar>
-            <w:top w:w="0" w:type="dxa"/>
-            <w:bottom w:w="0" w:type="dxa"/>
-          </w:tblCellMar>
-        </w:tblPrEx>
         <w:tc>
           <w:tcPr>
             <w:tcW w:w="400" w:type="dxa"/>
@@ -14009,12 +13756,6 @@
         </w:tc>
       </w:tr>
       <w:tr>
-        <w:tblPrEx>
-          <w:tblCellMar>
-            <w:top w:w="0" w:type="dxa"/>
-            <w:bottom w:w="0" w:type="dxa"/>
-          </w:tblCellMar>
-        </w:tblPrEx>
         <w:tc>
           <w:tcPr>
             <w:tcW w:w="400" w:type="dxa"/>
@@ -15352,8 +15093,6 @@
       <w:pPr>
         <w:spacing w:before="40" w:after="40"/>
       </w:pPr>
-      <w:bookmarkStart w:id="0" w:name="_GoBack"/>
-      <w:bookmarkEnd w:id="0"/>
     </w:p>
     <w:sectPr>
       <w:headerReference w:type="default" r:id="rId9"/>
@@ -15477,7 +15216,7 @@
         <w:sz w:val="20"/>
         <w:szCs w:val="20"/>
       </w:rPr>
-      <w:t>5</w:t>
+      <w:t>1</w:t>
     </w:r>
     <w:r>
       <w:rPr>

</xml_diff>